<commit_message>
Matériel pour les Marches-Conquête
</commit_message>
<xml_diff>
--- a/pictures/Les-Marches-Escarmouche/Escarmouche-couverture-boite-v3.docx
+++ b/pictures/Les-Marches-Escarmouche/Escarmouche-couverture-boite-v3.docx
@@ -11,7 +11,7 @@
           <w:noProof/>
         </w:rPr>
         <w:drawing>
-          <wp:inline distT="0" distB="0" distL="0" distR="0" wp14:anchorId="525FEA35" wp14:editId="76610D45">
+          <wp:inline distT="0" distB="0" distL="0" distR="0" wp14:anchorId="525FEA35" wp14:editId="464E4B8F">
             <wp:extent cx="4006766" cy="5436000"/>
             <wp:effectExtent l="0" t="0" r="0" b="0"/>
             <wp:docPr id="1887966945" name="Image 2"/>
@@ -30,6 +30,50 @@
                   <pic:blipFill>
                     <a:blip r:embed="rId4">
                       <a:extLst>
+                        <a:ext uri="{BEBA8EAE-BF5A-486C-A8C5-ECC9F3942E4B}">
+                          <a14:imgProps xmlns:a14="http://schemas.microsoft.com/office/drawing/2010/main">
+                            <a14:imgLayer r:embed="rId5">
+                              <a14:imgEffect>
+                                <a14:backgroundRemoval t="1096" b="99203" l="0" r="97973">
+                                  <a14:foregroundMark x1="0" y1="697" x2="3378" y2="87151"/>
+                                  <a14:foregroundMark x1="3378" y1="87151" x2="8514" y2="97510"/>
+                                  <a14:foregroundMark x1="8514" y1="97510" x2="97432" y2="97908"/>
+                                  <a14:foregroundMark x1="97432" y1="97908" x2="95541" y2="3884"/>
+                                  <a14:foregroundMark x1="95541" y1="3884" x2="0" y2="1195"/>
+                                  <a14:foregroundMark x1="1216" y1="69323" x2="946" y2="90737"/>
+                                  <a14:foregroundMark x1="946" y1="90737" x2="5270" y2="99701"/>
+                                  <a14:foregroundMark x1="5270" y1="99701" x2="67162" y2="99701"/>
+                                  <a14:foregroundMark x1="67162" y1="99701" x2="98108" y2="99602"/>
+                                  <a14:foregroundMark x1="98108" y1="99602" x2="98108" y2="74502"/>
+                                  <a14:foregroundMark x1="98108" y1="74502" x2="61216" y2="82769"/>
+                                  <a14:foregroundMark x1="61216" y1="82769" x2="37973" y2="80279"/>
+                                  <a14:foregroundMark x1="37973" y1="80279" x2="22162" y2="73506"/>
+                                  <a14:foregroundMark x1="22162" y1="73506" x2="946" y2="70219"/>
+                                  <a14:foregroundMark x1="1892" y1="2888" x2="811" y2="39841"/>
+                                  <a14:foregroundMark x1="811" y1="39841" x2="20135" y2="45916"/>
+                                  <a14:foregroundMark x1="20135" y1="45916" x2="45135" y2="40239"/>
+                                  <a14:foregroundMark x1="45135" y1="40239" x2="72568" y2="41036"/>
+                                  <a14:foregroundMark x1="72568" y1="41036" x2="80946" y2="48506"/>
+                                  <a14:foregroundMark x1="80946" y1="48506" x2="94189" y2="51992"/>
+                                  <a14:foregroundMark x1="94189" y1="51992" x2="99189" y2="27590"/>
+                                  <a14:foregroundMark x1="99189" y1="27590" x2="98108" y2="7869"/>
+                                  <a14:foregroundMark x1="98108" y1="7869" x2="82432" y2="1195"/>
+                                  <a14:foregroundMark x1="82432" y1="1195" x2="2162" y2="3586"/>
+                                  <a14:foregroundMark x1="676" y1="73008" x2="270" y2="94223"/>
+                                  <a14:foregroundMark x1="270" y1="94223" x2="18514" y2="99502"/>
+                                  <a14:foregroundMark x1="18514" y1="99502" x2="42838" y2="98606"/>
+                                  <a14:foregroundMark x1="42838" y1="98606" x2="20135" y2="99203"/>
+                                  <a14:foregroundMark x1="20135" y1="99203" x2="1351" y2="93725"/>
+                                  <a14:foregroundMark x1="1351" y1="93725" x2="4189" y2="80677"/>
+                                  <a14:foregroundMark x1="4189" y1="80677" x2="22432" y2="74402"/>
+                                  <a14:foregroundMark x1="22432" y1="74402" x2="50811" y2="82769"/>
+                                  <a14:foregroundMark x1="50811" y1="82769" x2="55946" y2="95219"/>
+                                  <a14:foregroundMark x1="55946" y1="95219" x2="45135" y2="99203"/>
+                                </a14:backgroundRemoval>
+                              </a14:imgEffect>
+                            </a14:imgLayer>
+                          </a14:imgProps>
+                        </a:ext>
                         <a:ext uri="{28A0092B-C50C-407E-A947-70E740481C1C}">
                           <a14:useLocalDpi xmlns:a14="http://schemas.microsoft.com/office/drawing/2010/main" val="0"/>
                         </a:ext>
@@ -59,6 +103,11 @@
           </wp:inline>
         </w:drawing>
       </w:r>
+    </w:p>
+    <w:p>
+      <w:pPr>
+        <w:jc w:val="center"/>
+      </w:pPr>
     </w:p>
     <w:sectPr>
       <w:pgSz w:w="11906" w:h="16838"/>

</xml_diff>